<commit_message>
Written bullet points describing the images/figures posted in the weekly progress report 5.
</commit_message>
<xml_diff>
--- a/Weekly Reports/WeeklyProgressReport-GroupB-Week5.docx
+++ b/Weekly Reports/WeeklyProgressReport-GroupB-Week5.docx
@@ -1533,6 +1533,7 @@
         </w:rPr>
         <w:t xml:space="preserve">ompleted in </w:t>
       </w:r>
+      <w:proofErr w:type="gramStart"/>
       <w:r>
         <w:rPr>
           <w:rFonts w:asciiTheme="minorHAnsi" w:hAnsiTheme="minorHAnsi" w:cstheme="minorHAnsi"/>
@@ -1545,7 +1546,15 @@
           <w:rFonts w:asciiTheme="minorHAnsi" w:hAnsiTheme="minorHAnsi" w:cstheme="minorHAnsi"/>
           <w:b/>
         </w:rPr>
-        <w:t xml:space="preserve">ext </w:t>
+        <w:t>ext</w:t>
+      </w:r>
+      <w:proofErr w:type="gramEnd"/>
+      <w:r>
+        <w:rPr>
+          <w:rFonts w:asciiTheme="minorHAnsi" w:hAnsiTheme="minorHAnsi" w:cstheme="minorHAnsi"/>
+          <w:b/>
+        </w:rPr>
+        <w:t xml:space="preserve"> </w:t>
       </w:r>
       <w:r>
         <w:rPr>
@@ -1664,7 +1673,23 @@
           <w:b w:val="0"/>
           <w:bCs/>
         </w:rPr>
-        <w:t>implement multi-model approach.</w:t>
+        <w:t xml:space="preserve">implement </w:t>
+      </w:r>
+      <w:proofErr w:type="gramStart"/>
+      <w:r>
+        <w:rPr>
+          <w:b w:val="0"/>
+          <w:bCs/>
+        </w:rPr>
+        <w:t>multi</w:t>
+      </w:r>
+      <w:proofErr w:type="gramEnd"/>
+      <w:r>
+        <w:rPr>
+          <w:b w:val="0"/>
+          <w:bCs/>
+        </w:rPr>
+        <w:t>-model approach.</w:t>
       </w:r>
     </w:p>
     <w:bookmarkEnd w:id="0"/>
@@ -1825,6 +1850,9 @@
         <w:jc w:val="center"/>
       </w:pPr>
       <w:r>
+        <w:rPr>
+          <w:noProof/>
+        </w:rPr>
         <w:drawing>
           <wp:inline distT="0" distB="0" distL="0" distR="0" wp14:anchorId="77809CA3" wp14:editId="5D3314B0">
             <wp:extent cx="5943600" cy="4824095"/>
@@ -1925,6 +1953,56 @@
     </w:p>
     <w:p>
       <w:pPr>
+        <w:pStyle w:val="ListParagraph"/>
+        <w:numPr>
+          <w:ilvl w:val="0"/>
+          <w:numId w:val="27"/>
+        </w:numPr>
+        <w:rPr>
+          <w:b w:val="0"/>
+          <w:bCs/>
+        </w:rPr>
+      </w:pPr>
+      <w:r>
+        <w:rPr>
+          <w:b w:val="0"/>
+          <w:bCs/>
+        </w:rPr>
+        <w:t>In this week, there were 15 issues resolved with numerous PRs</w:t>
+      </w:r>
+      <w:r>
+        <w:rPr>
+          <w:b w:val="0"/>
+          <w:bCs/>
+        </w:rPr>
+        <w:t xml:space="preserve">, contributing </w:t>
+      </w:r>
+      <w:proofErr w:type="gramStart"/>
+      <w:r>
+        <w:rPr>
+          <w:b w:val="0"/>
+          <w:bCs/>
+        </w:rPr>
+        <w:t>in</w:t>
+      </w:r>
+      <w:proofErr w:type="gramEnd"/>
+      <w:r>
+        <w:rPr>
+          <w:b w:val="0"/>
+          <w:bCs/>
+        </w:rPr>
+        <w:t xml:space="preserve"> development</w:t>
+      </w:r>
+      <w:r>
+        <w:rPr>
+          <w:b w:val="0"/>
+          <w:bCs/>
+        </w:rPr>
+        <w:t>.</w:t>
+      </w:r>
+    </w:p>
+    <w:p>
+      <w:pPr>
         <w:pStyle w:val="Heading1"/>
         <w:rPr>
           <w:rFonts w:asciiTheme="minorHAnsi" w:hAnsiTheme="minorHAnsi" w:cstheme="minorHAnsi"/>
@@ -1984,6 +2062,9 @@
         <w:jc w:val="center"/>
       </w:pPr>
       <w:r>
+        <w:rPr>
+          <w:noProof/>
+        </w:rPr>
         <w:drawing>
           <wp:inline distT="0" distB="0" distL="0" distR="0" wp14:anchorId="1ADFB199" wp14:editId="2D951CB4">
             <wp:extent cx="5943600" cy="4300220"/>
@@ -2089,6 +2170,107 @@
       </w:r>
       <w:r>
         <w:t>the Week</w:t>
+      </w:r>
+    </w:p>
+    <w:p>
+      <w:pPr>
+        <w:pStyle w:val="ListParagraph"/>
+        <w:numPr>
+          <w:ilvl w:val="0"/>
+          <w:numId w:val="26"/>
+        </w:numPr>
+      </w:pPr>
+      <w:r>
+        <w:rPr>
+          <w:b w:val="0"/>
+          <w:bCs/>
+        </w:rPr>
+        <w:t>This week, there were two pull requests generated and merged that included phase 1 of our project</w:t>
+      </w:r>
+      <w:r>
+        <w:rPr>
+          <w:b w:val="0"/>
+          <w:bCs/>
+        </w:rPr>
+        <w:t xml:space="preserve"> and documentation.</w:t>
+      </w:r>
+    </w:p>
+    <w:p>
+      <w:pPr>
+        <w:pStyle w:val="ListParagraph"/>
+        <w:numPr>
+          <w:ilvl w:val="0"/>
+          <w:numId w:val="26"/>
+        </w:numPr>
+      </w:pPr>
+      <w:r>
+        <w:rPr>
+          <w:b w:val="0"/>
+          <w:bCs/>
+        </w:rPr>
+        <w:t xml:space="preserve">The one active issue we </w:t>
+      </w:r>
+      <w:r>
+        <w:rPr>
+          <w:b w:val="0"/>
+          <w:bCs/>
+        </w:rPr>
+        <w:t>dealt</w:t>
+      </w:r>
+      <w:r>
+        <w:rPr>
+          <w:b w:val="0"/>
+          <w:bCs/>
+        </w:rPr>
+        <w:t xml:space="preserve"> with was the exception generated as shown in </w:t>
+      </w:r>
+      <w:proofErr w:type="gramStart"/>
+      <w:r>
+        <w:rPr>
+          <w:b w:val="0"/>
+          <w:bCs/>
+        </w:rPr>
+        <w:t xml:space="preserve">the </w:t>
+      </w:r>
+      <w:r>
+        <w:rPr>
+          <w:b w:val="0"/>
+          <w:bCs/>
+          <w:i/>
+          <w:iCs/>
+        </w:rPr>
+        <w:t>Figure</w:t>
+      </w:r>
+      <w:proofErr w:type="gramEnd"/>
+      <w:r>
+        <w:rPr>
+          <w:b w:val="0"/>
+          <w:bCs/>
+          <w:i/>
+          <w:iCs/>
+        </w:rPr>
+        <w:t xml:space="preserve"> 3</w:t>
+      </w:r>
+      <w:r>
+        <w:rPr>
+          <w:b w:val="0"/>
+          <w:bCs/>
+        </w:rPr>
+        <w:t>, took a lot of time and decided to shift it to the next</w:t>
+      </w:r>
+      <w:r>
+        <w:rPr>
+          <w:b w:val="0"/>
+          <w:bCs/>
+        </w:rPr>
+        <w:t xml:space="preserve"> scrum</w:t>
+      </w:r>
+      <w:r>
+        <w:rPr>
+          <w:b w:val="0"/>
+          <w:bCs/>
+        </w:rPr>
+        <w:t>.</w:t>
       </w:r>
     </w:p>
     <w:p>
@@ -2246,10 +2428,6 @@
     <w:p>
       <w:pPr>
         <w:pStyle w:val="Figure"/>
-        <w:rPr>
-          <w:rFonts w:cstheme="minorHAnsi"/>
-          <w:b/>
-        </w:rPr>
       </w:pPr>
       <w:r>
         <w:rPr>
@@ -2303,6 +2481,67 @@
       </w:r>
       <w:r>
         <w:t xml:space="preserve"> Exception – Progress Blocker</w:t>
+      </w:r>
+    </w:p>
+    <w:p>
+      <w:pPr>
+        <w:pStyle w:val="ListParagraph"/>
+        <w:numPr>
+          <w:ilvl w:val="0"/>
+          <w:numId w:val="25"/>
+        </w:numPr>
+        <w:rPr>
+          <w:b w:val="0"/>
+          <w:bCs/>
+        </w:rPr>
+      </w:pPr>
+      <w:r>
+        <w:rPr>
+          <w:b w:val="0"/>
+          <w:bCs/>
+        </w:rPr>
+        <w:t xml:space="preserve">The </w:t>
+      </w:r>
+      <w:r>
+        <w:rPr>
+          <w:b w:val="0"/>
+          <w:bCs/>
+        </w:rPr>
+        <w:t>exception when dealing with the image by the end user.</w:t>
+      </w:r>
+    </w:p>
+    <w:p>
+      <w:pPr>
+        <w:pStyle w:val="ListParagraph"/>
+        <w:numPr>
+          <w:ilvl w:val="0"/>
+          <w:numId w:val="25"/>
+        </w:numPr>
+        <w:rPr>
+          <w:b w:val="0"/>
+          <w:bCs/>
+        </w:rPr>
+      </w:pPr>
+      <w:r>
+        <w:rPr>
+          <w:b w:val="0"/>
+          <w:bCs/>
+        </w:rPr>
+        <w:t xml:space="preserve">Expecting it to be </w:t>
+      </w:r>
+      <w:r>
+        <w:rPr>
+          <w:b w:val="0"/>
+          <w:bCs/>
+        </w:rPr>
+        <w:t>re</w:t>
+      </w:r>
+      <w:r>
+        <w:rPr>
+          <w:b w:val="0"/>
+          <w:bCs/>
+        </w:rPr>
+        <w:t>solved in the next scrum.</w:t>
       </w:r>
     </w:p>
     <w:sectPr>
@@ -2707,6 +2946,118 @@
 <file path=word/numbering.xml><?xml version="1.0" encoding="utf-8"?>
 <w:numbering xmlns:wpc="http://schemas.microsoft.com/office/word/2010/wordprocessingCanvas" xmlns:cx="http://schemas.microsoft.com/office/drawing/2014/chartex" xmlns:cx1="http://schemas.microsoft.com/office/drawing/2015/9/8/chartex" xmlns:cx2="http://schemas.microsoft.com/office/drawing/2015/10/21/chartex" xmlns:cx3="http://schemas.microsoft.com/office/drawing/2016/5/9/chartex" xmlns:cx4="http://schemas.microsoft.com/office/drawing/2016/5/10/chartex" xmlns:cx5="http://schemas.microsoft.com/office/drawing/2016/5/11/chartex" xmlns:cx6="http://schemas.microsoft.com/office/drawing/2016/5/12/chartex" xmlns:cx7="http://schemas.microsoft.com/office/drawing/2016/5/13/chartex" xmlns:cx8="http://schemas.microsoft.com/office/drawing/2016/5/14/chartex" xmlns:mc="http://schemas.openxmlformats.org/markup-compatibility/2006" xmlns:aink="http://schemas.microsoft.com/office/drawing/2016/ink" xmlns:am3d="http://schemas.microsoft.com/office/drawing/2017/model3d" xmlns:o="urn:schemas-microsoft-com:office:office" xmlns:oel="http://schemas.microsoft.com/office/2019/extlst" xmlns:r="http://schemas.openxmlformats.org/officeDocument/2006/relationships" xmlns:m="http://schemas.openxmlformats.org/officeDocument/2006/math" xmlns:v="urn:schemas-microsoft-com:vml" xmlns:wp14="http://schemas.microsoft.com/office/word/2010/wordprocessingDrawing" xmlns:wp="http://schemas.openxmlformats.org/drawingml/2006/wordprocessingDrawing" xmlns:w10="urn:schemas-microsoft-com:office:word" xmlns:w="http://schemas.openxmlformats.org/wordprocessingml/2006/main" xmlns:w14="http://schemas.microsoft.com/office/word/2010/wordml" xmlns:w15="http://schemas.microsoft.com/office/word/2012/wordml" xmlns:w16cex="http://schemas.microsoft.com/office/word/2018/wordml/cex" xmlns:w16cid="http://schemas.microsoft.com/office/word/2016/wordml/cid" xmlns:w16="http://schemas.microsoft.com/office/word/2018/wordml" xmlns:w16du="http://schemas.microsoft.com/office/word/2023/wordml/word16du" xmlns:w16sdtdh="http://schemas.microsoft.com/office/word/2020/wordml/sdtdatahash" xmlns:w16se="http://schemas.microsoft.com/office/word/2015/wordml/symex" xmlns:wpg="http://schemas.microsoft.com/office/word/2010/wordprocessingGroup" xmlns:wpi="http://schemas.microsoft.com/office/word/2010/wordprocessingInk" xmlns:wne="http://schemas.microsoft.com/office/word/2006/wordml" xmlns:wps="http://schemas.microsoft.com/office/word/2010/wordprocessingShape" mc:Ignorable="w14 w15 w16se w16cid w16 w16cex w16sdtdh w16du wp14">
   <w:abstractNum w:abstractNumId="0" w15:restartNumberingAfterBreak="0">
+    <w:nsid w:val="0A3C461A"/>
+    <w:multiLevelType w:val="hybridMultilevel"/>
+    <w:tmpl w:val="5C1884FC"/>
+    <w:lvl w:ilvl="0" w:tplc="C6C2BC96">
+      <w:numFmt w:val="bullet"/>
+      <w:lvlText w:val="-"/>
+      <w:lvlJc w:val="left"/>
+      <w:pPr>
+        <w:ind w:left="720" w:hanging="360"/>
+      </w:pPr>
+      <w:rPr>
+        <w:rFonts w:ascii="Calibri" w:eastAsiaTheme="minorHAnsi" w:hAnsi="Calibri" w:cs="Calibri" w:hint="default"/>
+      </w:rPr>
+    </w:lvl>
+    <w:lvl w:ilvl="1" w:tplc="10090003" w:tentative="1">
+      <w:start w:val="1"/>
+      <w:numFmt w:val="bullet"/>
+      <w:lvlText w:val="o"/>
+      <w:lvlJc w:val="left"/>
+      <w:pPr>
+        <w:ind w:left="1440" w:hanging="360"/>
+      </w:pPr>
+      <w:rPr>
+        <w:rFonts w:ascii="Courier New" w:hAnsi="Courier New" w:cs="Courier New" w:hint="default"/>
+      </w:rPr>
+    </w:lvl>
+    <w:lvl w:ilvl="2" w:tplc="10090005" w:tentative="1">
+      <w:start w:val="1"/>
+      <w:numFmt w:val="bullet"/>
+      <w:lvlText w:val=""/>
+      <w:lvlJc w:val="left"/>
+      <w:pPr>
+        <w:ind w:left="2160" w:hanging="360"/>
+      </w:pPr>
+      <w:rPr>
+        <w:rFonts w:ascii="Wingdings" w:hAnsi="Wingdings" w:hint="default"/>
+      </w:rPr>
+    </w:lvl>
+    <w:lvl w:ilvl="3" w:tplc="10090001" w:tentative="1">
+      <w:start w:val="1"/>
+      <w:numFmt w:val="bullet"/>
+      <w:lvlText w:val=""/>
+      <w:lvlJc w:val="left"/>
+      <w:pPr>
+        <w:ind w:left="2880" w:hanging="360"/>
+      </w:pPr>
+      <w:rPr>
+        <w:rFonts w:ascii="Symbol" w:hAnsi="Symbol" w:hint="default"/>
+      </w:rPr>
+    </w:lvl>
+    <w:lvl w:ilvl="4" w:tplc="10090003" w:tentative="1">
+      <w:start w:val="1"/>
+      <w:numFmt w:val="bullet"/>
+      <w:lvlText w:val="o"/>
+      <w:lvlJc w:val="left"/>
+      <w:pPr>
+        <w:ind w:left="3600" w:hanging="360"/>
+      </w:pPr>
+      <w:rPr>
+        <w:rFonts w:ascii="Courier New" w:hAnsi="Courier New" w:cs="Courier New" w:hint="default"/>
+      </w:rPr>
+    </w:lvl>
+    <w:lvl w:ilvl="5" w:tplc="10090005" w:tentative="1">
+      <w:start w:val="1"/>
+      <w:numFmt w:val="bullet"/>
+      <w:lvlText w:val=""/>
+      <w:lvlJc w:val="left"/>
+      <w:pPr>
+        <w:ind w:left="4320" w:hanging="360"/>
+      </w:pPr>
+      <w:rPr>
+        <w:rFonts w:ascii="Wingdings" w:hAnsi="Wingdings" w:hint="default"/>
+      </w:rPr>
+    </w:lvl>
+    <w:lvl w:ilvl="6" w:tplc="10090001" w:tentative="1">
+      <w:start w:val="1"/>
+      <w:numFmt w:val="bullet"/>
+      <w:lvlText w:val=""/>
+      <w:lvlJc w:val="left"/>
+      <w:pPr>
+        <w:ind w:left="5040" w:hanging="360"/>
+      </w:pPr>
+      <w:rPr>
+        <w:rFonts w:ascii="Symbol" w:hAnsi="Symbol" w:hint="default"/>
+      </w:rPr>
+    </w:lvl>
+    <w:lvl w:ilvl="7" w:tplc="10090003" w:tentative="1">
+      <w:start w:val="1"/>
+      <w:numFmt w:val="bullet"/>
+      <w:lvlText w:val="o"/>
+      <w:lvlJc w:val="left"/>
+      <w:pPr>
+        <w:ind w:left="5760" w:hanging="360"/>
+      </w:pPr>
+      <w:rPr>
+        <w:rFonts w:ascii="Courier New" w:hAnsi="Courier New" w:cs="Courier New" w:hint="default"/>
+      </w:rPr>
+    </w:lvl>
+    <w:lvl w:ilvl="8" w:tplc="10090005" w:tentative="1">
+      <w:start w:val="1"/>
+      <w:numFmt w:val="bullet"/>
+      <w:lvlText w:val=""/>
+      <w:lvlJc w:val="left"/>
+      <w:pPr>
+        <w:ind w:left="6480" w:hanging="360"/>
+      </w:pPr>
+      <w:rPr>
+        <w:rFonts w:ascii="Wingdings" w:hAnsi="Wingdings" w:hint="default"/>
+      </w:rPr>
+    </w:lvl>
+  </w:abstractNum>
+  <w:abstractNum w:abstractNumId="1" w15:restartNumberingAfterBreak="0">
     <w:nsid w:val="126F4E98"/>
     <w:multiLevelType w:val="hybridMultilevel"/>
     <w:tmpl w:val="FE3CCF56"/>
@@ -2819,7 +3170,7 @@
       </w:rPr>
     </w:lvl>
   </w:abstractNum>
-  <w:abstractNum w:abstractNumId="1" w15:restartNumberingAfterBreak="0">
+  <w:abstractNum w:abstractNumId="2" w15:restartNumberingAfterBreak="0">
     <w:nsid w:val="1DA5797B"/>
     <w:multiLevelType w:val="hybridMultilevel"/>
     <w:tmpl w:val="7D989140"/>
@@ -2908,7 +3259,7 @@
       </w:pPr>
     </w:lvl>
   </w:abstractNum>
-  <w:abstractNum w:abstractNumId="2" w15:restartNumberingAfterBreak="0">
+  <w:abstractNum w:abstractNumId="3" w15:restartNumberingAfterBreak="0">
     <w:nsid w:val="338F38C1"/>
     <w:multiLevelType w:val="hybridMultilevel"/>
     <w:tmpl w:val="E0E2E94A"/>
@@ -3021,7 +3372,119 @@
       </w:rPr>
     </w:lvl>
   </w:abstractNum>
-  <w:abstractNum w:abstractNumId="3" w15:restartNumberingAfterBreak="0">
+  <w:abstractNum w:abstractNumId="4" w15:restartNumberingAfterBreak="0">
+    <w:nsid w:val="396752BA"/>
+    <w:multiLevelType w:val="hybridMultilevel"/>
+    <w:tmpl w:val="3026676E"/>
+    <w:lvl w:ilvl="0" w:tplc="1B10BF02">
+      <w:numFmt w:val="bullet"/>
+      <w:lvlText w:val="-"/>
+      <w:lvlJc w:val="left"/>
+      <w:pPr>
+        <w:ind w:left="720" w:hanging="360"/>
+      </w:pPr>
+      <w:rPr>
+        <w:rFonts w:ascii="Calibri" w:eastAsiaTheme="minorHAnsi" w:hAnsi="Calibri" w:cs="Calibri" w:hint="default"/>
+      </w:rPr>
+    </w:lvl>
+    <w:lvl w:ilvl="1" w:tplc="10090003" w:tentative="1">
+      <w:start w:val="1"/>
+      <w:numFmt w:val="bullet"/>
+      <w:lvlText w:val="o"/>
+      <w:lvlJc w:val="left"/>
+      <w:pPr>
+        <w:ind w:left="1440" w:hanging="360"/>
+      </w:pPr>
+      <w:rPr>
+        <w:rFonts w:ascii="Courier New" w:hAnsi="Courier New" w:cs="Courier New" w:hint="default"/>
+      </w:rPr>
+    </w:lvl>
+    <w:lvl w:ilvl="2" w:tplc="10090005" w:tentative="1">
+      <w:start w:val="1"/>
+      <w:numFmt w:val="bullet"/>
+      <w:lvlText w:val=""/>
+      <w:lvlJc w:val="left"/>
+      <w:pPr>
+        <w:ind w:left="2160" w:hanging="360"/>
+      </w:pPr>
+      <w:rPr>
+        <w:rFonts w:ascii="Wingdings" w:hAnsi="Wingdings" w:hint="default"/>
+      </w:rPr>
+    </w:lvl>
+    <w:lvl w:ilvl="3" w:tplc="10090001" w:tentative="1">
+      <w:start w:val="1"/>
+      <w:numFmt w:val="bullet"/>
+      <w:lvlText w:val=""/>
+      <w:lvlJc w:val="left"/>
+      <w:pPr>
+        <w:ind w:left="2880" w:hanging="360"/>
+      </w:pPr>
+      <w:rPr>
+        <w:rFonts w:ascii="Symbol" w:hAnsi="Symbol" w:hint="default"/>
+      </w:rPr>
+    </w:lvl>
+    <w:lvl w:ilvl="4" w:tplc="10090003" w:tentative="1">
+      <w:start w:val="1"/>
+      <w:numFmt w:val="bullet"/>
+      <w:lvlText w:val="o"/>
+      <w:lvlJc w:val="left"/>
+      <w:pPr>
+        <w:ind w:left="3600" w:hanging="360"/>
+      </w:pPr>
+      <w:rPr>
+        <w:rFonts w:ascii="Courier New" w:hAnsi="Courier New" w:cs="Courier New" w:hint="default"/>
+      </w:rPr>
+    </w:lvl>
+    <w:lvl w:ilvl="5" w:tplc="10090005" w:tentative="1">
+      <w:start w:val="1"/>
+      <w:numFmt w:val="bullet"/>
+      <w:lvlText w:val=""/>
+      <w:lvlJc w:val="left"/>
+      <w:pPr>
+        <w:ind w:left="4320" w:hanging="360"/>
+      </w:pPr>
+      <w:rPr>
+        <w:rFonts w:ascii="Wingdings" w:hAnsi="Wingdings" w:hint="default"/>
+      </w:rPr>
+    </w:lvl>
+    <w:lvl w:ilvl="6" w:tplc="10090001" w:tentative="1">
+      <w:start w:val="1"/>
+      <w:numFmt w:val="bullet"/>
+      <w:lvlText w:val=""/>
+      <w:lvlJc w:val="left"/>
+      <w:pPr>
+        <w:ind w:left="5040" w:hanging="360"/>
+      </w:pPr>
+      <w:rPr>
+        <w:rFonts w:ascii="Symbol" w:hAnsi="Symbol" w:hint="default"/>
+      </w:rPr>
+    </w:lvl>
+    <w:lvl w:ilvl="7" w:tplc="10090003" w:tentative="1">
+      <w:start w:val="1"/>
+      <w:numFmt w:val="bullet"/>
+      <w:lvlText w:val="o"/>
+      <w:lvlJc w:val="left"/>
+      <w:pPr>
+        <w:ind w:left="5760" w:hanging="360"/>
+      </w:pPr>
+      <w:rPr>
+        <w:rFonts w:ascii="Courier New" w:hAnsi="Courier New" w:cs="Courier New" w:hint="default"/>
+      </w:rPr>
+    </w:lvl>
+    <w:lvl w:ilvl="8" w:tplc="10090005" w:tentative="1">
+      <w:start w:val="1"/>
+      <w:numFmt w:val="bullet"/>
+      <w:lvlText w:val=""/>
+      <w:lvlJc w:val="left"/>
+      <w:pPr>
+        <w:ind w:left="6480" w:hanging="360"/>
+      </w:pPr>
+      <w:rPr>
+        <w:rFonts w:ascii="Wingdings" w:hAnsi="Wingdings" w:hint="default"/>
+      </w:rPr>
+    </w:lvl>
+  </w:abstractNum>
+  <w:abstractNum w:abstractNumId="5" w15:restartNumberingAfterBreak="0">
     <w:nsid w:val="3DBF7F21"/>
     <w:multiLevelType w:val="hybridMultilevel"/>
     <w:tmpl w:val="D6FE893E"/>
@@ -3107,7 +3570,7 @@
       </w:pPr>
     </w:lvl>
   </w:abstractNum>
-  <w:abstractNum w:abstractNumId="4" w15:restartNumberingAfterBreak="0">
+  <w:abstractNum w:abstractNumId="6" w15:restartNumberingAfterBreak="0">
     <w:nsid w:val="4B814719"/>
     <w:multiLevelType w:val="hybridMultilevel"/>
     <w:tmpl w:val="819222B0"/>
@@ -3193,7 +3656,7 @@
       </w:pPr>
     </w:lvl>
   </w:abstractNum>
-  <w:abstractNum w:abstractNumId="5" w15:restartNumberingAfterBreak="0">
+  <w:abstractNum w:abstractNumId="7" w15:restartNumberingAfterBreak="0">
     <w:nsid w:val="551B4267"/>
     <w:multiLevelType w:val="hybridMultilevel"/>
     <w:tmpl w:val="C9EACDCC"/>
@@ -3279,7 +3742,7 @@
       </w:pPr>
     </w:lvl>
   </w:abstractNum>
-  <w:abstractNum w:abstractNumId="6" w15:restartNumberingAfterBreak="0">
+  <w:abstractNum w:abstractNumId="8" w15:restartNumberingAfterBreak="0">
     <w:nsid w:val="58E803B7"/>
     <w:multiLevelType w:val="hybridMultilevel"/>
     <w:tmpl w:val="165E89D2"/>
@@ -3371,7 +3834,7 @@
       </w:pPr>
     </w:lvl>
   </w:abstractNum>
-  <w:abstractNum w:abstractNumId="7" w15:restartNumberingAfterBreak="0">
+  <w:abstractNum w:abstractNumId="9" w15:restartNumberingAfterBreak="0">
     <w:nsid w:val="59AA0E19"/>
     <w:multiLevelType w:val="hybridMultilevel"/>
     <w:tmpl w:val="5A48DD92"/>
@@ -3457,7 +3920,7 @@
       </w:pPr>
     </w:lvl>
   </w:abstractNum>
-  <w:abstractNum w:abstractNumId="8" w15:restartNumberingAfterBreak="0">
+  <w:abstractNum w:abstractNumId="10" w15:restartNumberingAfterBreak="0">
     <w:nsid w:val="5D526B05"/>
     <w:multiLevelType w:val="multilevel"/>
     <w:tmpl w:val="20245940"/>
@@ -3581,7 +4044,7 @@
       </w:rPr>
     </w:lvl>
   </w:abstractNum>
-  <w:abstractNum w:abstractNumId="9" w15:restartNumberingAfterBreak="0">
+  <w:abstractNum w:abstractNumId="11" w15:restartNumberingAfterBreak="0">
     <w:nsid w:val="608B12D0"/>
     <w:multiLevelType w:val="hybridMultilevel"/>
     <w:tmpl w:val="E4EA9D94"/>
@@ -3667,7 +4130,7 @@
       </w:pPr>
     </w:lvl>
   </w:abstractNum>
-  <w:abstractNum w:abstractNumId="10" w15:restartNumberingAfterBreak="0">
+  <w:abstractNum w:abstractNumId="12" w15:restartNumberingAfterBreak="0">
     <w:nsid w:val="60E448A3"/>
     <w:multiLevelType w:val="hybridMultilevel"/>
     <w:tmpl w:val="39E8EF08"/>
@@ -3753,7 +4216,7 @@
       </w:pPr>
     </w:lvl>
   </w:abstractNum>
-  <w:abstractNum w:abstractNumId="11" w15:restartNumberingAfterBreak="0">
+  <w:abstractNum w:abstractNumId="13" w15:restartNumberingAfterBreak="0">
     <w:nsid w:val="624F3CCA"/>
     <w:multiLevelType w:val="hybridMultilevel"/>
     <w:tmpl w:val="83D651FE"/>
@@ -3839,7 +4302,7 @@
       </w:pPr>
     </w:lvl>
   </w:abstractNum>
-  <w:abstractNum w:abstractNumId="12" w15:restartNumberingAfterBreak="0">
+  <w:abstractNum w:abstractNumId="14" w15:restartNumberingAfterBreak="0">
     <w:nsid w:val="64B961A3"/>
     <w:multiLevelType w:val="hybridMultilevel"/>
     <w:tmpl w:val="0FCA25B6"/>
@@ -3952,7 +4415,119 @@
       </w:rPr>
     </w:lvl>
   </w:abstractNum>
-  <w:abstractNum w:abstractNumId="13" w15:restartNumberingAfterBreak="0">
+  <w:abstractNum w:abstractNumId="15" w15:restartNumberingAfterBreak="0">
+    <w:nsid w:val="6A4C2729"/>
+    <w:multiLevelType w:val="hybridMultilevel"/>
+    <w:tmpl w:val="91FAC1DE"/>
+    <w:lvl w:ilvl="0" w:tplc="EA44FA78">
+      <w:numFmt w:val="bullet"/>
+      <w:lvlText w:val="-"/>
+      <w:lvlJc w:val="left"/>
+      <w:pPr>
+        <w:ind w:left="720" w:hanging="360"/>
+      </w:pPr>
+      <w:rPr>
+        <w:rFonts w:ascii="Calibri" w:eastAsiaTheme="minorHAnsi" w:hAnsi="Calibri" w:cs="Calibri" w:hint="default"/>
+      </w:rPr>
+    </w:lvl>
+    <w:lvl w:ilvl="1" w:tplc="10090003" w:tentative="1">
+      <w:start w:val="1"/>
+      <w:numFmt w:val="bullet"/>
+      <w:lvlText w:val="o"/>
+      <w:lvlJc w:val="left"/>
+      <w:pPr>
+        <w:ind w:left="1440" w:hanging="360"/>
+      </w:pPr>
+      <w:rPr>
+        <w:rFonts w:ascii="Courier New" w:hAnsi="Courier New" w:cs="Courier New" w:hint="default"/>
+      </w:rPr>
+    </w:lvl>
+    <w:lvl w:ilvl="2" w:tplc="10090005" w:tentative="1">
+      <w:start w:val="1"/>
+      <w:numFmt w:val="bullet"/>
+      <w:lvlText w:val=""/>
+      <w:lvlJc w:val="left"/>
+      <w:pPr>
+        <w:ind w:left="2160" w:hanging="360"/>
+      </w:pPr>
+      <w:rPr>
+        <w:rFonts w:ascii="Wingdings" w:hAnsi="Wingdings" w:hint="default"/>
+      </w:rPr>
+    </w:lvl>
+    <w:lvl w:ilvl="3" w:tplc="10090001" w:tentative="1">
+      <w:start w:val="1"/>
+      <w:numFmt w:val="bullet"/>
+      <w:lvlText w:val=""/>
+      <w:lvlJc w:val="left"/>
+      <w:pPr>
+        <w:ind w:left="2880" w:hanging="360"/>
+      </w:pPr>
+      <w:rPr>
+        <w:rFonts w:ascii="Symbol" w:hAnsi="Symbol" w:hint="default"/>
+      </w:rPr>
+    </w:lvl>
+    <w:lvl w:ilvl="4" w:tplc="10090003" w:tentative="1">
+      <w:start w:val="1"/>
+      <w:numFmt w:val="bullet"/>
+      <w:lvlText w:val="o"/>
+      <w:lvlJc w:val="left"/>
+      <w:pPr>
+        <w:ind w:left="3600" w:hanging="360"/>
+      </w:pPr>
+      <w:rPr>
+        <w:rFonts w:ascii="Courier New" w:hAnsi="Courier New" w:cs="Courier New" w:hint="default"/>
+      </w:rPr>
+    </w:lvl>
+    <w:lvl w:ilvl="5" w:tplc="10090005" w:tentative="1">
+      <w:start w:val="1"/>
+      <w:numFmt w:val="bullet"/>
+      <w:lvlText w:val=""/>
+      <w:lvlJc w:val="left"/>
+      <w:pPr>
+        <w:ind w:left="4320" w:hanging="360"/>
+      </w:pPr>
+      <w:rPr>
+        <w:rFonts w:ascii="Wingdings" w:hAnsi="Wingdings" w:hint="default"/>
+      </w:rPr>
+    </w:lvl>
+    <w:lvl w:ilvl="6" w:tplc="10090001" w:tentative="1">
+      <w:start w:val="1"/>
+      <w:numFmt w:val="bullet"/>
+      <w:lvlText w:val=""/>
+      <w:lvlJc w:val="left"/>
+      <w:pPr>
+        <w:ind w:left="5040" w:hanging="360"/>
+      </w:pPr>
+      <w:rPr>
+        <w:rFonts w:ascii="Symbol" w:hAnsi="Symbol" w:hint="default"/>
+      </w:rPr>
+    </w:lvl>
+    <w:lvl w:ilvl="7" w:tplc="10090003" w:tentative="1">
+      <w:start w:val="1"/>
+      <w:numFmt w:val="bullet"/>
+      <w:lvlText w:val="o"/>
+      <w:lvlJc w:val="left"/>
+      <w:pPr>
+        <w:ind w:left="5760" w:hanging="360"/>
+      </w:pPr>
+      <w:rPr>
+        <w:rFonts w:ascii="Courier New" w:hAnsi="Courier New" w:cs="Courier New" w:hint="default"/>
+      </w:rPr>
+    </w:lvl>
+    <w:lvl w:ilvl="8" w:tplc="10090005" w:tentative="1">
+      <w:start w:val="1"/>
+      <w:numFmt w:val="bullet"/>
+      <w:lvlText w:val=""/>
+      <w:lvlJc w:val="left"/>
+      <w:pPr>
+        <w:ind w:left="6480" w:hanging="360"/>
+      </w:pPr>
+      <w:rPr>
+        <w:rFonts w:ascii="Wingdings" w:hAnsi="Wingdings" w:hint="default"/>
+      </w:rPr>
+    </w:lvl>
+  </w:abstractNum>
+  <w:abstractNum w:abstractNumId="16" w15:restartNumberingAfterBreak="0">
     <w:nsid w:val="6C7F173D"/>
     <w:multiLevelType w:val="hybridMultilevel"/>
     <w:tmpl w:val="7C38DA8E"/>
@@ -4041,7 +4616,120 @@
       </w:pPr>
     </w:lvl>
   </w:abstractNum>
-  <w:abstractNum w:abstractNumId="14" w15:restartNumberingAfterBreak="0">
+  <w:abstractNum w:abstractNumId="17" w15:restartNumberingAfterBreak="0">
+    <w:nsid w:val="733A533C"/>
+    <w:multiLevelType w:val="hybridMultilevel"/>
+    <w:tmpl w:val="EF3432E2"/>
+    <w:lvl w:ilvl="0" w:tplc="9C62F894">
+      <w:numFmt w:val="bullet"/>
+      <w:lvlText w:val="-"/>
+      <w:lvlJc w:val="left"/>
+      <w:pPr>
+        <w:ind w:left="720" w:hanging="360"/>
+      </w:pPr>
+      <w:rPr>
+        <w:rFonts w:ascii="Calibri" w:eastAsiaTheme="minorHAnsi" w:hAnsi="Calibri" w:cs="Calibri" w:hint="default"/>
+        <w:b w:val="0"/>
+      </w:rPr>
+    </w:lvl>
+    <w:lvl w:ilvl="1" w:tplc="10090003" w:tentative="1">
+      <w:start w:val="1"/>
+      <w:numFmt w:val="bullet"/>
+      <w:lvlText w:val="o"/>
+      <w:lvlJc w:val="left"/>
+      <w:pPr>
+        <w:ind w:left="1440" w:hanging="360"/>
+      </w:pPr>
+      <w:rPr>
+        <w:rFonts w:ascii="Courier New" w:hAnsi="Courier New" w:cs="Courier New" w:hint="default"/>
+      </w:rPr>
+    </w:lvl>
+    <w:lvl w:ilvl="2" w:tplc="10090005" w:tentative="1">
+      <w:start w:val="1"/>
+      <w:numFmt w:val="bullet"/>
+      <w:lvlText w:val=""/>
+      <w:lvlJc w:val="left"/>
+      <w:pPr>
+        <w:ind w:left="2160" w:hanging="360"/>
+      </w:pPr>
+      <w:rPr>
+        <w:rFonts w:ascii="Wingdings" w:hAnsi="Wingdings" w:hint="default"/>
+      </w:rPr>
+    </w:lvl>
+    <w:lvl w:ilvl="3" w:tplc="10090001" w:tentative="1">
+      <w:start w:val="1"/>
+      <w:numFmt w:val="bullet"/>
+      <w:lvlText w:val=""/>
+      <w:lvlJc w:val="left"/>
+      <w:pPr>
+        <w:ind w:left="2880" w:hanging="360"/>
+      </w:pPr>
+      <w:rPr>
+        <w:rFonts w:ascii="Symbol" w:hAnsi="Symbol" w:hint="default"/>
+      </w:rPr>
+    </w:lvl>
+    <w:lvl w:ilvl="4" w:tplc="10090003" w:tentative="1">
+      <w:start w:val="1"/>
+      <w:numFmt w:val="bullet"/>
+      <w:lvlText w:val="o"/>
+      <w:lvlJc w:val="left"/>
+      <w:pPr>
+        <w:ind w:left="3600" w:hanging="360"/>
+      </w:pPr>
+      <w:rPr>
+        <w:rFonts w:ascii="Courier New" w:hAnsi="Courier New" w:cs="Courier New" w:hint="default"/>
+      </w:rPr>
+    </w:lvl>
+    <w:lvl w:ilvl="5" w:tplc="10090005" w:tentative="1">
+      <w:start w:val="1"/>
+      <w:numFmt w:val="bullet"/>
+      <w:lvlText w:val=""/>
+      <w:lvlJc w:val="left"/>
+      <w:pPr>
+        <w:ind w:left="4320" w:hanging="360"/>
+      </w:pPr>
+      <w:rPr>
+        <w:rFonts w:ascii="Wingdings" w:hAnsi="Wingdings" w:hint="default"/>
+      </w:rPr>
+    </w:lvl>
+    <w:lvl w:ilvl="6" w:tplc="10090001" w:tentative="1">
+      <w:start w:val="1"/>
+      <w:numFmt w:val="bullet"/>
+      <w:lvlText w:val=""/>
+      <w:lvlJc w:val="left"/>
+      <w:pPr>
+        <w:ind w:left="5040" w:hanging="360"/>
+      </w:pPr>
+      <w:rPr>
+        <w:rFonts w:ascii="Symbol" w:hAnsi="Symbol" w:hint="default"/>
+      </w:rPr>
+    </w:lvl>
+    <w:lvl w:ilvl="7" w:tplc="10090003" w:tentative="1">
+      <w:start w:val="1"/>
+      <w:numFmt w:val="bullet"/>
+      <w:lvlText w:val="o"/>
+      <w:lvlJc w:val="left"/>
+      <w:pPr>
+        <w:ind w:left="5760" w:hanging="360"/>
+      </w:pPr>
+      <w:rPr>
+        <w:rFonts w:ascii="Courier New" w:hAnsi="Courier New" w:cs="Courier New" w:hint="default"/>
+      </w:rPr>
+    </w:lvl>
+    <w:lvl w:ilvl="8" w:tplc="10090005" w:tentative="1">
+      <w:start w:val="1"/>
+      <w:numFmt w:val="bullet"/>
+      <w:lvlText w:val=""/>
+      <w:lvlJc w:val="left"/>
+      <w:pPr>
+        <w:ind w:left="6480" w:hanging="360"/>
+      </w:pPr>
+      <w:rPr>
+        <w:rFonts w:ascii="Wingdings" w:hAnsi="Wingdings" w:hint="default"/>
+      </w:rPr>
+    </w:lvl>
+  </w:abstractNum>
+  <w:abstractNum w:abstractNumId="18" w15:restartNumberingAfterBreak="0">
     <w:nsid w:val="73EE4FBE"/>
     <w:multiLevelType w:val="hybridMultilevel"/>
     <w:tmpl w:val="4C805BFC"/>
@@ -4127,7 +4815,119 @@
       </w:pPr>
     </w:lvl>
   </w:abstractNum>
-  <w:abstractNum w:abstractNumId="15" w15:restartNumberingAfterBreak="0">
+  <w:abstractNum w:abstractNumId="19" w15:restartNumberingAfterBreak="0">
+    <w:nsid w:val="741B0EB3"/>
+    <w:multiLevelType w:val="hybridMultilevel"/>
+    <w:tmpl w:val="31921CDA"/>
+    <w:lvl w:ilvl="0" w:tplc="0464C578">
+      <w:numFmt w:val="bullet"/>
+      <w:lvlText w:val="-"/>
+      <w:lvlJc w:val="left"/>
+      <w:pPr>
+        <w:ind w:left="720" w:hanging="360"/>
+      </w:pPr>
+      <w:rPr>
+        <w:rFonts w:ascii="Calibri" w:eastAsiaTheme="minorHAnsi" w:hAnsi="Calibri" w:cs="Calibri" w:hint="default"/>
+      </w:rPr>
+    </w:lvl>
+    <w:lvl w:ilvl="1" w:tplc="10090003" w:tentative="1">
+      <w:start w:val="1"/>
+      <w:numFmt w:val="bullet"/>
+      <w:lvlText w:val="o"/>
+      <w:lvlJc w:val="left"/>
+      <w:pPr>
+        <w:ind w:left="1440" w:hanging="360"/>
+      </w:pPr>
+      <w:rPr>
+        <w:rFonts w:ascii="Courier New" w:hAnsi="Courier New" w:cs="Courier New" w:hint="default"/>
+      </w:rPr>
+    </w:lvl>
+    <w:lvl w:ilvl="2" w:tplc="10090005" w:tentative="1">
+      <w:start w:val="1"/>
+      <w:numFmt w:val="bullet"/>
+      <w:lvlText w:val=""/>
+      <w:lvlJc w:val="left"/>
+      <w:pPr>
+        <w:ind w:left="2160" w:hanging="360"/>
+      </w:pPr>
+      <w:rPr>
+        <w:rFonts w:ascii="Wingdings" w:hAnsi="Wingdings" w:hint="default"/>
+      </w:rPr>
+    </w:lvl>
+    <w:lvl w:ilvl="3" w:tplc="10090001" w:tentative="1">
+      <w:start w:val="1"/>
+      <w:numFmt w:val="bullet"/>
+      <w:lvlText w:val=""/>
+      <w:lvlJc w:val="left"/>
+      <w:pPr>
+        <w:ind w:left="2880" w:hanging="360"/>
+      </w:pPr>
+      <w:rPr>
+        <w:rFonts w:ascii="Symbol" w:hAnsi="Symbol" w:hint="default"/>
+      </w:rPr>
+    </w:lvl>
+    <w:lvl w:ilvl="4" w:tplc="10090003" w:tentative="1">
+      <w:start w:val="1"/>
+      <w:numFmt w:val="bullet"/>
+      <w:lvlText w:val="o"/>
+      <w:lvlJc w:val="left"/>
+      <w:pPr>
+        <w:ind w:left="3600" w:hanging="360"/>
+      </w:pPr>
+      <w:rPr>
+        <w:rFonts w:ascii="Courier New" w:hAnsi="Courier New" w:cs="Courier New" w:hint="default"/>
+      </w:rPr>
+    </w:lvl>
+    <w:lvl w:ilvl="5" w:tplc="10090005" w:tentative="1">
+      <w:start w:val="1"/>
+      <w:numFmt w:val="bullet"/>
+      <w:lvlText w:val=""/>
+      <w:lvlJc w:val="left"/>
+      <w:pPr>
+        <w:ind w:left="4320" w:hanging="360"/>
+      </w:pPr>
+      <w:rPr>
+        <w:rFonts w:ascii="Wingdings" w:hAnsi="Wingdings" w:hint="default"/>
+      </w:rPr>
+    </w:lvl>
+    <w:lvl w:ilvl="6" w:tplc="10090001" w:tentative="1">
+      <w:start w:val="1"/>
+      <w:numFmt w:val="bullet"/>
+      <w:lvlText w:val=""/>
+      <w:lvlJc w:val="left"/>
+      <w:pPr>
+        <w:ind w:left="5040" w:hanging="360"/>
+      </w:pPr>
+      <w:rPr>
+        <w:rFonts w:ascii="Symbol" w:hAnsi="Symbol" w:hint="default"/>
+      </w:rPr>
+    </w:lvl>
+    <w:lvl w:ilvl="7" w:tplc="10090003" w:tentative="1">
+      <w:start w:val="1"/>
+      <w:numFmt w:val="bullet"/>
+      <w:lvlText w:val="o"/>
+      <w:lvlJc w:val="left"/>
+      <w:pPr>
+        <w:ind w:left="5760" w:hanging="360"/>
+      </w:pPr>
+      <w:rPr>
+        <w:rFonts w:ascii="Courier New" w:hAnsi="Courier New" w:cs="Courier New" w:hint="default"/>
+      </w:rPr>
+    </w:lvl>
+    <w:lvl w:ilvl="8" w:tplc="10090005" w:tentative="1">
+      <w:start w:val="1"/>
+      <w:numFmt w:val="bullet"/>
+      <w:lvlText w:val=""/>
+      <w:lvlJc w:val="left"/>
+      <w:pPr>
+        <w:ind w:left="6480" w:hanging="360"/>
+      </w:pPr>
+      <w:rPr>
+        <w:rFonts w:ascii="Wingdings" w:hAnsi="Wingdings" w:hint="default"/>
+      </w:rPr>
+    </w:lvl>
+  </w:abstractNum>
+  <w:abstractNum w:abstractNumId="20" w15:restartNumberingAfterBreak="0">
     <w:nsid w:val="7B5C470C"/>
     <w:multiLevelType w:val="hybridMultilevel"/>
     <w:tmpl w:val="BE16CE38"/>
@@ -4241,69 +5041,84 @@
     </w:lvl>
   </w:abstractNum>
   <w:num w:numId="1" w16cid:durableId="244193377">
+    <w:abstractNumId w:val="20"/>
+  </w:num>
+  <w:num w:numId="2" w16cid:durableId="869342601">
+    <w:abstractNumId w:val="3"/>
+  </w:num>
+  <w:num w:numId="3" w16cid:durableId="239213030">
+    <w:abstractNumId w:val="12"/>
+  </w:num>
+  <w:num w:numId="4" w16cid:durableId="534081370">
+    <w:abstractNumId w:val="2"/>
+  </w:num>
+  <w:num w:numId="5" w16cid:durableId="731853724">
+    <w:abstractNumId w:val="8"/>
+  </w:num>
+  <w:num w:numId="6" w16cid:durableId="778915253">
+    <w:abstractNumId w:val="9"/>
+  </w:num>
+  <w:num w:numId="7" w16cid:durableId="2146924523">
+    <w:abstractNumId w:val="7"/>
+  </w:num>
+  <w:num w:numId="8" w16cid:durableId="1970088903">
+    <w:abstractNumId w:val="13"/>
+  </w:num>
+  <w:num w:numId="9" w16cid:durableId="1128207112">
+    <w:abstractNumId w:val="18"/>
+  </w:num>
+  <w:num w:numId="10" w16cid:durableId="2108231001">
+    <w:abstractNumId w:val="5"/>
+  </w:num>
+  <w:num w:numId="11" w16cid:durableId="1874731181">
+    <w:abstractNumId w:val="16"/>
+  </w:num>
+  <w:num w:numId="12" w16cid:durableId="1868446919">
+    <w:abstractNumId w:val="6"/>
+  </w:num>
+  <w:num w:numId="13" w16cid:durableId="1669599215">
+    <w:abstractNumId w:val="11"/>
+  </w:num>
+  <w:num w:numId="14" w16cid:durableId="1450121530">
+    <w:abstractNumId w:val="10"/>
+  </w:num>
+  <w:num w:numId="15" w16cid:durableId="1322393808">
+    <w:abstractNumId w:val="10"/>
+  </w:num>
+  <w:num w:numId="16" w16cid:durableId="2101480876">
+    <w:abstractNumId w:val="10"/>
+  </w:num>
+  <w:num w:numId="17" w16cid:durableId="188569482">
+    <w:abstractNumId w:val="10"/>
+  </w:num>
+  <w:num w:numId="18" w16cid:durableId="1061903777">
+    <w:abstractNumId w:val="10"/>
+  </w:num>
+  <w:num w:numId="19" w16cid:durableId="1667902038">
+    <w:abstractNumId w:val="10"/>
+  </w:num>
+  <w:num w:numId="20" w16cid:durableId="1389568115">
+    <w:abstractNumId w:val="10"/>
+  </w:num>
+  <w:num w:numId="21" w16cid:durableId="586354120">
+    <w:abstractNumId w:val="14"/>
+  </w:num>
+  <w:num w:numId="22" w16cid:durableId="1599824507">
+    <w:abstractNumId w:val="1"/>
+  </w:num>
+  <w:num w:numId="23" w16cid:durableId="2101438809">
+    <w:abstractNumId w:val="17"/>
+  </w:num>
+  <w:num w:numId="24" w16cid:durableId="1106073915">
     <w:abstractNumId w:val="15"/>
   </w:num>
-  <w:num w:numId="2" w16cid:durableId="869342601">
-    <w:abstractNumId w:val="2"/>
+  <w:num w:numId="25" w16cid:durableId="2037346418">
+    <w:abstractNumId w:val="19"/>
   </w:num>
-  <w:num w:numId="3" w16cid:durableId="239213030">
-    <w:abstractNumId w:val="10"/>
-  </w:num>
-  <w:num w:numId="4" w16cid:durableId="534081370">
-    <w:abstractNumId w:val="1"/>
-  </w:num>
-  <w:num w:numId="5" w16cid:durableId="731853724">
-    <w:abstractNumId w:val="6"/>
-  </w:num>
-  <w:num w:numId="6" w16cid:durableId="778915253">
-    <w:abstractNumId w:val="7"/>
-  </w:num>
-  <w:num w:numId="7" w16cid:durableId="2146924523">
-    <w:abstractNumId w:val="5"/>
-  </w:num>
-  <w:num w:numId="8" w16cid:durableId="1970088903">
-    <w:abstractNumId w:val="11"/>
-  </w:num>
-  <w:num w:numId="9" w16cid:durableId="1128207112">
-    <w:abstractNumId w:val="14"/>
-  </w:num>
-  <w:num w:numId="10" w16cid:durableId="2108231001">
-    <w:abstractNumId w:val="3"/>
-  </w:num>
-  <w:num w:numId="11" w16cid:durableId="1874731181">
-    <w:abstractNumId w:val="13"/>
-  </w:num>
-  <w:num w:numId="12" w16cid:durableId="1868446919">
+  <w:num w:numId="26" w16cid:durableId="1390959885">
     <w:abstractNumId w:val="4"/>
   </w:num>
-  <w:num w:numId="13" w16cid:durableId="1669599215">
-    <w:abstractNumId w:val="9"/>
-  </w:num>
-  <w:num w:numId="14" w16cid:durableId="1450121530">
-    <w:abstractNumId w:val="8"/>
-  </w:num>
-  <w:num w:numId="15" w16cid:durableId="1322393808">
-    <w:abstractNumId w:val="8"/>
-  </w:num>
-  <w:num w:numId="16" w16cid:durableId="2101480876">
-    <w:abstractNumId w:val="8"/>
-  </w:num>
-  <w:num w:numId="17" w16cid:durableId="188569482">
-    <w:abstractNumId w:val="8"/>
-  </w:num>
-  <w:num w:numId="18" w16cid:durableId="1061903777">
-    <w:abstractNumId w:val="8"/>
-  </w:num>
-  <w:num w:numId="19" w16cid:durableId="1667902038">
-    <w:abstractNumId w:val="8"/>
-  </w:num>
-  <w:num w:numId="20" w16cid:durableId="1389568115">
-    <w:abstractNumId w:val="8"/>
-  </w:num>
-  <w:num w:numId="21" w16cid:durableId="586354120">
-    <w:abstractNumId w:val="12"/>
-  </w:num>
-  <w:num w:numId="22" w16cid:durableId="1599824507">
+  <w:num w:numId="27" w16cid:durableId="121844844">
     <w:abstractNumId w:val="0"/>
   </w:num>
 </w:numbering>

</xml_diff>